<commit_message>
More onoff situations and add other props + fix bug with endless loop
</commit_message>
<xml_diff>
--- a/tests/examples/tbl.docx
+++ b/tests/examples/tbl.docx
@@ -1,6 +1,6 @@
 
 <file path=word/document.xml><?xml version="1.0" encoding="utf-8"?>
-<w:document xmlns:wpc="http://schemas.microsoft.com/office/word/2010/wordprocessingCanvas" xmlns:cx="http://schemas.microsoft.com/office/drawing/2014/chartex" xmlns:cx1="http://schemas.microsoft.com/office/drawing/2015/9/8/chartex" xmlns:cx2="http://schemas.microsoft.com/office/drawing/2015/10/21/chartex" xmlns:cx3="http://schemas.microsoft.com/office/drawing/2016/5/9/chartex" xmlns:cx4="http://schemas.microsoft.com/office/drawing/2016/5/10/chartex" xmlns:cx5="http://schemas.microsoft.com/office/drawing/2016/5/11/chartex" xmlns:cx6="http://schemas.microsoft.com/office/drawing/2016/5/12/chartex" xmlns:cx7="http://schemas.microsoft.com/office/drawing/2016/5/13/chartex" xmlns:cx8="http://schemas.microsoft.com/office/drawing/2016/5/14/chartex" xmlns:mc="http://schemas.openxmlformats.org/markup-compatibility/2006" xmlns:aink="http://schemas.microsoft.com/office/drawing/2016/ink" xmlns:am3d="http://schemas.microsoft.com/office/drawing/2017/model3d" xmlns:o="urn:schemas-microsoft-com:office:office" xmlns:r="http://schemas.openxmlformats.org/officeDocument/2006/relationships" xmlns:m="http://schemas.openxmlformats.org/officeDocument/2006/math" xmlns:v="urn:schemas-microsoft-com:vml" xmlns:wp14="http://schemas.microsoft.com/office/word/2010/wordprocessingDrawing" xmlns:wp="http://schemas.openxmlformats.org/drawingml/2006/wordprocessingDrawing" xmlns:w10="urn:schemas-microsoft-com:office:word" xmlns:w="http://schemas.openxmlformats.org/wordprocessingml/2006/main" xmlns:w14="http://schemas.microsoft.com/office/word/2010/wordml" xmlns:w15="http://schemas.microsoft.com/office/word/2012/wordml" xmlns:w16cex="http://schemas.microsoft.com/office/word/2018/wordml/cex" xmlns:w16cid="http://schemas.microsoft.com/office/word/2016/wordml/cid" xmlns:w16="http://schemas.microsoft.com/office/word/2018/wordml" xmlns:w16se="http://schemas.microsoft.com/office/word/2015/wordml/symex" xmlns:wpg="http://schemas.microsoft.com/office/word/2010/wordprocessingGroup" xmlns:wpi="http://schemas.microsoft.com/office/word/2010/wordprocessingInk" xmlns:wne="http://schemas.microsoft.com/office/word/2006/wordml" xmlns:wps="http://schemas.microsoft.com/office/word/2010/wordprocessingShape" mc:Ignorable="w14 w15 w16se w16cid w16 w16cex wp14">
+<w:document xmlns:wpc="http://schemas.microsoft.com/office/word/2010/wordprocessingCanvas" xmlns:cx="http://schemas.microsoft.com/office/drawing/2014/chartex" xmlns:cx1="http://schemas.microsoft.com/office/drawing/2015/9/8/chartex" xmlns:cx2="http://schemas.microsoft.com/office/drawing/2015/10/21/chartex" xmlns:cx3="http://schemas.microsoft.com/office/drawing/2016/5/9/chartex" xmlns:cx4="http://schemas.microsoft.com/office/drawing/2016/5/10/chartex" xmlns:cx5="http://schemas.microsoft.com/office/drawing/2016/5/11/chartex" xmlns:cx6="http://schemas.microsoft.com/office/drawing/2016/5/12/chartex" xmlns:cx7="http://schemas.microsoft.com/office/drawing/2016/5/13/chartex" xmlns:cx8="http://schemas.microsoft.com/office/drawing/2016/5/14/chartex" xmlns:mc="http://schemas.openxmlformats.org/markup-compatibility/2006" xmlns:aink="http://schemas.microsoft.com/office/drawing/2016/ink" xmlns:am3d="http://schemas.microsoft.com/office/drawing/2017/model3d" xmlns:o="urn:schemas-microsoft-com:office:office" xmlns:r="http://schemas.openxmlformats.org/officeDocument/2006/relationships" xmlns:m="http://schemas.openxmlformats.org/officeDocument/2006/math" xmlns:v="urn:schemas-microsoft-com:vml" xmlns:wp14="http://schemas.microsoft.com/office/word/2010/wordprocessingDrawing" xmlns:wp="http://schemas.openxmlformats.org/drawingml/2006/wordprocessingDrawing" xmlns:w10="urn:schemas-microsoft-com:office:word" xmlns:w="http://schemas.openxmlformats.org/wordprocessingml/2006/main" xmlns:w14="http://schemas.microsoft.com/office/word/2010/wordml" xmlns:w15="http://schemas.microsoft.com/office/word/2012/wordml" xmlns:w16cex="http://schemas.microsoft.com/office/word/2018/wordml/cex" xmlns:w16cid="http://schemas.microsoft.com/office/word/2016/wordml/cid" xmlns:w16="http://schemas.microsoft.com/office/word/2018/wordml" xmlns:w16sdtdh="http://schemas.microsoft.com/office/word/2020/wordml/sdtdatahash" xmlns:w16se="http://schemas.microsoft.com/office/word/2015/wordml/symex" xmlns:wpg="http://schemas.microsoft.com/office/word/2010/wordprocessingGroup" xmlns:wpi="http://schemas.microsoft.com/office/word/2010/wordprocessingInk" xmlns:wne="http://schemas.microsoft.com/office/word/2006/wordml" xmlns:wps="http://schemas.microsoft.com/office/word/2010/wordprocessingShape" mc:Ignorable="w14 w15 w16se w16cid w16 w16cex w16sdtdh wp14">
   <w:body>
     <w:tbl>
       <w:tblPr>
@@ -27,13 +27,17 @@
                 <w:lang w:val="en-US"/>
               </w:rPr>
             </w:pPr>
-            <w:bookmarkStart w:id="0" w:name="_GoBack"/>
-            <w:bookmarkEnd w:id="0"/>
             <w:r>
               <w:rPr>
                 <w:lang w:val="en-US"/>
               </w:rPr>
               <w:t>1</w:t>
+            </w:r>
+            <w:r>
+              <w:rPr>
+                <w:lang w:val="en-US"/>
+              </w:rPr>
+              <w:t>CAPS</w:t>
             </w:r>
           </w:p>
         </w:tc>
@@ -202,7 +206,7 @@
 </file>
 
 <file path=word/styles.xml><?xml version="1.0" encoding="utf-8"?>
-<w:styles xmlns:mc="http://schemas.openxmlformats.org/markup-compatibility/2006" xmlns:r="http://schemas.openxmlformats.org/officeDocument/2006/relationships" xmlns:w="http://schemas.openxmlformats.org/wordprocessingml/2006/main" xmlns:w14="http://schemas.microsoft.com/office/word/2010/wordml" xmlns:w15="http://schemas.microsoft.com/office/word/2012/wordml" xmlns:w16cex="http://schemas.microsoft.com/office/word/2018/wordml/cex" xmlns:w16cid="http://schemas.microsoft.com/office/word/2016/wordml/cid" xmlns:w16="http://schemas.microsoft.com/office/word/2018/wordml" xmlns:w16se="http://schemas.microsoft.com/office/word/2015/wordml/symex" mc:Ignorable="w14 w15 w16se w16cid w16 w16cex">
+<w:styles xmlns:mc="http://schemas.openxmlformats.org/markup-compatibility/2006" xmlns:r="http://schemas.openxmlformats.org/officeDocument/2006/relationships" xmlns:w="http://schemas.openxmlformats.org/wordprocessingml/2006/main" xmlns:w14="http://schemas.microsoft.com/office/word/2010/wordml" xmlns:w15="http://schemas.microsoft.com/office/word/2012/wordml" xmlns:w16cex="http://schemas.microsoft.com/office/word/2018/wordml/cex" xmlns:w16cid="http://schemas.microsoft.com/office/word/2016/wordml/cid" xmlns:w16="http://schemas.microsoft.com/office/word/2018/wordml" xmlns:w16sdtdh="http://schemas.microsoft.com/office/word/2020/wordml/sdtdatahash" xmlns:w16se="http://schemas.microsoft.com/office/word/2015/wordml/symex" mc:Ignorable="w14 w15 w16se w16cid w16 w16cex w16sdtdh">
   <w:docDefaults>
     <w:rPrDefault>
       <w:rPr>
@@ -654,7 +658,7 @@
     <w:name w:val="FirstRow"/>
     <w:basedOn w:val="a1"/>
     <w:uiPriority w:val="99"/>
-    <w:rsid w:val="00ED79A6"/>
+    <w:rsid w:val="001C1B36"/>
     <w:pPr>
       <w:spacing w:after="0" w:line="240" w:lineRule="auto"/>
     </w:pPr>
@@ -662,6 +666,8 @@
     <w:tblStylePr w:type="firstRow">
       <w:rPr>
         <w:i/>
+        <w:caps/>
+        <w:smallCaps w:val="0"/>
       </w:rPr>
       <w:tblPr/>
       <w:tcPr>
@@ -685,6 +691,8 @@
     <w:tblStylePr w:type="firstRow">
       <w:rPr>
         <w:i w:val="0"/>
+        <w:caps/>
+        <w:smallCaps w:val="0"/>
       </w:rPr>
       <w:tblPr/>
       <w:tcPr>
@@ -724,6 +732,8 @@
       <w:rPr>
         <w:b/>
         <w:i/>
+        <w:caps/>
+        <w:smallCaps w:val="0"/>
       </w:rPr>
       <w:tblPr/>
       <w:tcPr>

</xml_diff>

<commit_message>
Non zero spacing realized, now wait for spazing zero conditions
</commit_message>
<xml_diff>
--- a/tests/examples/tbl.docx
+++ b/tests/examples/tbl.docx
@@ -9,9 +9,9 @@
         <w:tblLook w:val="01E0" w:firstRow="1" w:lastRow="1" w:firstColumn="1" w:lastColumn="1" w:noHBand="0" w:noVBand="0"/>
       </w:tblPr>
       <w:tblGrid>
-        <w:gridCol w:w="3115"/>
-        <w:gridCol w:w="3115"/>
-        <w:gridCol w:w="3115"/>
+        <w:gridCol w:w="3145"/>
+        <w:gridCol w:w="3070"/>
+        <w:gridCol w:w="3130"/>
       </w:tblGrid>
       <w:tr>
         <w:trPr>
@@ -771,8 +771,13 @@
     <w:name w:val="FirstRowOnlyOuter"/>
     <w:basedOn w:val="LastRow"/>
     <w:uiPriority w:val="99"/>
-    <w:rsid w:val="00F01281"/>
-    <w:tblPr/>
+    <w:rsid w:val="000F3C51"/>
+    <w:tblPr>
+      <w:tblCellSpacing w:w="71" w:type="dxa"/>
+    </w:tblPr>
+    <w:trPr>
+      <w:tblCellSpacing w:w="71" w:type="dxa"/>
+    </w:trPr>
     <w:tblStylePr w:type="firstRow">
       <w:rPr>
         <w:b/>

</xml_diff>